<commit_message>
Align WDDAM portfolio USD roll-ups to FCFA ÷ 555.56 across site and config.
Recalculate Development Engine economics ($15.8M / $78.8M / $2.05B) with canonical 15/10/9/7/9 cohort mix and clarify four-engine baseline scope.

Co-authored-by: Cursor <cursoragent@cursor.com>
</commit_message>
<xml_diff>
--- a/assets/docs/workforce-deployment/05-portfolio-economics-appendix.docx
+++ b/assets/docs/workforce-deployment/05-portfolio-economics-appendix.docx
@@ -92,13 +92,8 @@
         </w:rPr>
       </w:pPr>
       <w:r>
-        <w:rPr>
-          <w:noProof/>
-        </w:rPr>
-      </w:r>
-      <w:r>
         <w:pict w14:anchorId="7AE246ED">
-          <v:rect id="Horizontal Line 1" o:spid="_x0000_s1070" style="width:468pt;height:.1pt;visibility:visible;mso-wrap-style:square;mso-left-percent:-10001;mso-top-percent:-10001;mso-position-horizontal:absolute;mso-position-horizontal-relative:char;mso-position-vertical:absolute;mso-position-vertical-relative:line;mso-left-percent:-10001;mso-top-percent:-10001;v-text-anchor:top" o:gfxdata="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" filled="f">
+          <v:rect id="Horizontal Line 1" o:spid="_x0000_s1070" alt="" style="width:468pt;height:.1pt;visibility:visible;mso-wrap-style:square;mso-width-percent:0;mso-height-percent:0;mso-left-percent:-10001;mso-top-percent:-10001;mso-position-horizontal:absolute;mso-position-horizontal-relative:char;mso-position-vertical:absolute;mso-position-vertical-relative:line;mso-width-percent:0;mso-height-percent:0;mso-left-percent:-10001;mso-top-percent:-10001;v-text-anchor:top" filled="f">
             <o:lock v:ext="edit" rotation="t" aspectratio="t" verticies="t" text="t" shapetype="t"/>
             <w10:anchorlock/>
           </v:rect>
@@ -319,13 +314,8 @@
         </w:rPr>
       </w:pPr>
       <w:r>
-        <w:rPr>
-          <w:noProof/>
-        </w:rPr>
-      </w:r>
-      <w:r>
         <w:pict w14:anchorId="701321E0">
-          <v:rect id="Horizontal Line 2" o:spid="_x0000_s1069" style="width:468pt;height:.1pt;visibility:visible;mso-wrap-style:square;mso-left-percent:-10001;mso-top-percent:-10001;mso-position-horizontal:absolute;mso-position-horizontal-relative:char;mso-position-vertical:absolute;mso-position-vertical-relative:line;mso-left-percent:-10001;mso-top-percent:-10001;v-text-anchor:top" o:gfxdata="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" filled="f">
+          <v:rect id="Horizontal Line 2" o:spid="_x0000_s1069" alt="" style="width:468pt;height:.1pt;visibility:visible;mso-wrap-style:square;mso-width-percent:0;mso-height-percent:0;mso-left-percent:-10001;mso-top-percent:-10001;mso-position-horizontal:absolute;mso-position-horizontal-relative:char;mso-position-vertical:absolute;mso-position-vertical-relative:line;mso-width-percent:0;mso-height-percent:0;mso-left-percent:-10001;mso-top-percent:-10001;v-text-anchor:top" filled="f">
             <o:lock v:ext="edit" rotation="t" aspectratio="t" verticies="t" text="t" shapetype="t"/>
             <w10:anchorlock/>
           </v:rect>
@@ -368,6 +358,7 @@
           <w:bottom w:val="single" w:sz="6" w:space="0" w:color="auto"/>
           <w:right w:val="single" w:sz="6" w:space="0" w:color="auto"/>
         </w:tblBorders>
+        <w:tblLayout w:type="fixed"/>
         <w:tblCellMar>
           <w:top w:w="160" w:type="dxa"/>
           <w:left w:w="160" w:type="dxa"/>
@@ -377,11 +368,11 @@
         <w:tblLook w:val="04A0" w:firstRow="1" w:lastRow="0" w:firstColumn="1" w:lastColumn="0" w:noHBand="0" w:noVBand="1"/>
       </w:tblPr>
       <w:tblGrid>
-        <w:gridCol w:w="866"/>
-        <w:gridCol w:w="3172"/>
-        <w:gridCol w:w="2026"/>
-        <w:gridCol w:w="1827"/>
-        <w:gridCol w:w="1453"/>
+        <w:gridCol w:w="863"/>
+        <w:gridCol w:w="2671"/>
+        <w:gridCol w:w="2128"/>
+        <w:gridCol w:w="1843"/>
+        <w:gridCol w:w="1839"/>
       </w:tblGrid>
       <w:tr>
         <w:trPr>
@@ -389,7 +380,7 @@
         </w:trPr>
         <w:tc>
           <w:tcPr>
-            <w:tcW w:w="0" w:type="auto"/>
+            <w:tcW w:w="863" w:type="dxa"/>
             <w:tcBorders>
               <w:top w:val="single" w:sz="6" w:space="0" w:color="auto"/>
               <w:left w:val="single" w:sz="6" w:space="0" w:color="auto"/>
@@ -432,7 +423,7 @@
         </w:tc>
         <w:tc>
           <w:tcPr>
-            <w:tcW w:w="1673" w:type="pct"/>
+            <w:tcW w:w="2671" w:type="dxa"/>
             <w:tcBorders>
               <w:top w:val="single" w:sz="6" w:space="0" w:color="auto"/>
               <w:left w:val="single" w:sz="6" w:space="0" w:color="auto"/>
@@ -475,7 +466,7 @@
         </w:tc>
         <w:tc>
           <w:tcPr>
-            <w:tcW w:w="442" w:type="pct"/>
+            <w:tcW w:w="2128" w:type="dxa"/>
             <w:tcBorders>
               <w:top w:val="single" w:sz="6" w:space="0" w:color="auto"/>
               <w:left w:val="single" w:sz="6" w:space="0" w:color="auto"/>
@@ -530,7 +521,7 @@
         </w:tc>
         <w:tc>
           <w:tcPr>
-            <w:tcW w:w="1657" w:type="pct"/>
+            <w:tcW w:w="1843" w:type="dxa"/>
             <w:tcBorders>
               <w:top w:val="single" w:sz="6" w:space="0" w:color="auto"/>
               <w:left w:val="single" w:sz="6" w:space="0" w:color="auto"/>
@@ -573,7 +564,7 @@
         </w:tc>
         <w:tc>
           <w:tcPr>
-            <w:tcW w:w="0" w:type="auto"/>
+            <w:tcW w:w="1839" w:type="dxa"/>
             <w:tcBorders>
               <w:top w:val="single" w:sz="6" w:space="0" w:color="auto"/>
               <w:left w:val="single" w:sz="6" w:space="0" w:color="auto"/>
@@ -618,7 +609,7 @@
       <w:tr>
         <w:tc>
           <w:tcPr>
-            <w:tcW w:w="0" w:type="auto"/>
+            <w:tcW w:w="863" w:type="dxa"/>
             <w:tcBorders>
               <w:top w:val="single" w:sz="6" w:space="0" w:color="auto"/>
               <w:left w:val="single" w:sz="6" w:space="0" w:color="auto"/>
@@ -656,7 +647,7 @@
         </w:tc>
         <w:tc>
           <w:tcPr>
-            <w:tcW w:w="1673" w:type="pct"/>
+            <w:tcW w:w="2671" w:type="dxa"/>
             <w:tcBorders>
               <w:top w:val="single" w:sz="6" w:space="0" w:color="auto"/>
               <w:left w:val="single" w:sz="6" w:space="0" w:color="auto"/>
@@ -694,7 +685,7 @@
         </w:tc>
         <w:tc>
           <w:tcPr>
-            <w:tcW w:w="442" w:type="pct"/>
+            <w:tcW w:w="2128" w:type="dxa"/>
             <w:tcBorders>
               <w:top w:val="single" w:sz="6" w:space="0" w:color="auto"/>
               <w:left w:val="single" w:sz="6" w:space="0" w:color="auto"/>
@@ -732,7 +723,7 @@
         </w:tc>
         <w:tc>
           <w:tcPr>
-            <w:tcW w:w="1657" w:type="pct"/>
+            <w:tcW w:w="1843" w:type="dxa"/>
             <w:tcBorders>
               <w:top w:val="single" w:sz="6" w:space="0" w:color="auto"/>
               <w:left w:val="single" w:sz="6" w:space="0" w:color="auto"/>
@@ -764,13 +755,13 @@
                 <w:kern w:val="0"/>
                 <w14:ligatures w14:val="none"/>
               </w:rPr>
-              <w:t>20</w:t>
+              <w:t>15</w:t>
             </w:r>
           </w:p>
         </w:tc>
         <w:tc>
           <w:tcPr>
-            <w:tcW w:w="0" w:type="auto"/>
+            <w:tcW w:w="1839" w:type="dxa"/>
             <w:tcBorders>
               <w:top w:val="single" w:sz="6" w:space="0" w:color="auto"/>
               <w:left w:val="single" w:sz="6" w:space="0" w:color="auto"/>
@@ -802,7 +793,31 @@
                 <w:kern w:val="0"/>
                 <w14:ligatures w14:val="none"/>
               </w:rPr>
-              <w:t>90,000,000</w:t>
+              <w:t>67</w:t>
+            </w:r>
+            <w:r>
+              <w:rPr>
+                <w:rFonts w:ascii="Times New Roman" w:eastAsia="Times New Roman" w:hAnsi="Times New Roman" w:cs="Times New Roman"/>
+                <w:kern w:val="0"/>
+                <w14:ligatures w14:val="none"/>
+              </w:rPr>
+              <w:t>,</w:t>
+            </w:r>
+            <w:r>
+              <w:rPr>
+                <w:rFonts w:ascii="Times New Roman" w:eastAsia="Times New Roman" w:hAnsi="Times New Roman" w:cs="Times New Roman"/>
+                <w:kern w:val="0"/>
+                <w14:ligatures w14:val="none"/>
+              </w:rPr>
+              <w:t>5</w:t>
+            </w:r>
+            <w:r>
+              <w:rPr>
+                <w:rFonts w:ascii="Times New Roman" w:eastAsia="Times New Roman" w:hAnsi="Times New Roman" w:cs="Times New Roman"/>
+                <w:kern w:val="0"/>
+                <w14:ligatures w14:val="none"/>
+              </w:rPr>
+              <w:t>00,000</w:t>
             </w:r>
           </w:p>
         </w:tc>
@@ -810,7 +825,7 @@
       <w:tr>
         <w:tc>
           <w:tcPr>
-            <w:tcW w:w="0" w:type="auto"/>
+            <w:tcW w:w="863" w:type="dxa"/>
             <w:tcBorders>
               <w:top w:val="single" w:sz="6" w:space="0" w:color="auto"/>
               <w:left w:val="single" w:sz="6" w:space="0" w:color="auto"/>
@@ -848,7 +863,7 @@
         </w:tc>
         <w:tc>
           <w:tcPr>
-            <w:tcW w:w="1673" w:type="pct"/>
+            <w:tcW w:w="2671" w:type="dxa"/>
             <w:tcBorders>
               <w:top w:val="single" w:sz="6" w:space="0" w:color="auto"/>
               <w:left w:val="single" w:sz="6" w:space="0" w:color="auto"/>
@@ -886,7 +901,7 @@
         </w:tc>
         <w:tc>
           <w:tcPr>
-            <w:tcW w:w="442" w:type="pct"/>
+            <w:tcW w:w="2128" w:type="dxa"/>
             <w:tcBorders>
               <w:top w:val="single" w:sz="6" w:space="0" w:color="auto"/>
               <w:left w:val="single" w:sz="6" w:space="0" w:color="auto"/>
@@ -924,7 +939,7 @@
         </w:tc>
         <w:tc>
           <w:tcPr>
-            <w:tcW w:w="1657" w:type="pct"/>
+            <w:tcW w:w="1843" w:type="dxa"/>
             <w:tcBorders>
               <w:top w:val="single" w:sz="6" w:space="0" w:color="auto"/>
               <w:left w:val="single" w:sz="6" w:space="0" w:color="auto"/>
@@ -962,7 +977,7 @@
         </w:tc>
         <w:tc>
           <w:tcPr>
-            <w:tcW w:w="0" w:type="auto"/>
+            <w:tcW w:w="1839" w:type="dxa"/>
             <w:tcBorders>
               <w:top w:val="single" w:sz="6" w:space="0" w:color="auto"/>
               <w:left w:val="single" w:sz="6" w:space="0" w:color="auto"/>
@@ -1002,7 +1017,7 @@
       <w:tr>
         <w:tc>
           <w:tcPr>
-            <w:tcW w:w="0" w:type="auto"/>
+            <w:tcW w:w="863" w:type="dxa"/>
             <w:tcBorders>
               <w:top w:val="single" w:sz="6" w:space="0" w:color="auto"/>
               <w:left w:val="single" w:sz="6" w:space="0" w:color="auto"/>
@@ -1040,7 +1055,7 @@
         </w:tc>
         <w:tc>
           <w:tcPr>
-            <w:tcW w:w="1673" w:type="pct"/>
+            <w:tcW w:w="2671" w:type="dxa"/>
             <w:tcBorders>
               <w:top w:val="single" w:sz="6" w:space="0" w:color="auto"/>
               <w:left w:val="single" w:sz="6" w:space="0" w:color="auto"/>
@@ -1078,7 +1093,7 @@
         </w:tc>
         <w:tc>
           <w:tcPr>
-            <w:tcW w:w="442" w:type="pct"/>
+            <w:tcW w:w="2128" w:type="dxa"/>
             <w:tcBorders>
               <w:top w:val="single" w:sz="6" w:space="0" w:color="auto"/>
               <w:left w:val="single" w:sz="6" w:space="0" w:color="auto"/>
@@ -1116,7 +1131,7 @@
         </w:tc>
         <w:tc>
           <w:tcPr>
-            <w:tcW w:w="1657" w:type="pct"/>
+            <w:tcW w:w="1843" w:type="dxa"/>
             <w:tcBorders>
               <w:top w:val="single" w:sz="6" w:space="0" w:color="auto"/>
               <w:left w:val="single" w:sz="6" w:space="0" w:color="auto"/>
@@ -1148,13 +1163,13 @@
                 <w:kern w:val="0"/>
                 <w14:ligatures w14:val="none"/>
               </w:rPr>
-              <w:t>8</w:t>
+              <w:t>9</w:t>
             </w:r>
           </w:p>
         </w:tc>
         <w:tc>
           <w:tcPr>
-            <w:tcW w:w="0" w:type="auto"/>
+            <w:tcW w:w="1839" w:type="dxa"/>
             <w:tcBorders>
               <w:top w:val="single" w:sz="6" w:space="0" w:color="auto"/>
               <w:left w:val="single" w:sz="6" w:space="0" w:color="auto"/>
@@ -1186,7 +1201,15 @@
                 <w:kern w:val="0"/>
                 <w14:ligatures w14:val="none"/>
               </w:rPr>
-              <w:t>72,000,000</w:t>
+              <w:t>81</w:t>
+            </w:r>
+            <w:r>
+              <w:rPr>
+                <w:rFonts w:ascii="Times New Roman" w:eastAsia="Times New Roman" w:hAnsi="Times New Roman" w:cs="Times New Roman"/>
+                <w:kern w:val="0"/>
+                <w14:ligatures w14:val="none"/>
+              </w:rPr>
+              <w:t>,000,000</w:t>
             </w:r>
           </w:p>
         </w:tc>
@@ -1194,7 +1217,7 @@
       <w:tr>
         <w:tc>
           <w:tcPr>
-            <w:tcW w:w="0" w:type="auto"/>
+            <w:tcW w:w="863" w:type="dxa"/>
             <w:tcBorders>
               <w:top w:val="single" w:sz="6" w:space="0" w:color="auto"/>
               <w:left w:val="single" w:sz="6" w:space="0" w:color="auto"/>
@@ -1233,7 +1256,7 @@
         </w:tc>
         <w:tc>
           <w:tcPr>
-            <w:tcW w:w="1673" w:type="pct"/>
+            <w:tcW w:w="2671" w:type="dxa"/>
             <w:tcBorders>
               <w:top w:val="single" w:sz="6" w:space="0" w:color="auto"/>
               <w:left w:val="single" w:sz="6" w:space="0" w:color="auto"/>
@@ -1271,7 +1294,7 @@
         </w:tc>
         <w:tc>
           <w:tcPr>
-            <w:tcW w:w="442" w:type="pct"/>
+            <w:tcW w:w="2128" w:type="dxa"/>
             <w:tcBorders>
               <w:top w:val="single" w:sz="6" w:space="0" w:color="auto"/>
               <w:left w:val="single" w:sz="6" w:space="0" w:color="auto"/>
@@ -1309,7 +1332,7 @@
         </w:tc>
         <w:tc>
           <w:tcPr>
-            <w:tcW w:w="1657" w:type="pct"/>
+            <w:tcW w:w="1843" w:type="dxa"/>
             <w:tcBorders>
               <w:top w:val="single" w:sz="6" w:space="0" w:color="auto"/>
               <w:left w:val="single" w:sz="6" w:space="0" w:color="auto"/>
@@ -1347,7 +1370,7 @@
         </w:tc>
         <w:tc>
           <w:tcPr>
-            <w:tcW w:w="0" w:type="auto"/>
+            <w:tcW w:w="1839" w:type="dxa"/>
             <w:tcBorders>
               <w:top w:val="single" w:sz="6" w:space="0" w:color="auto"/>
               <w:left w:val="single" w:sz="6" w:space="0" w:color="auto"/>
@@ -1387,7 +1410,7 @@
       <w:tr>
         <w:tc>
           <w:tcPr>
-            <w:tcW w:w="0" w:type="auto"/>
+            <w:tcW w:w="863" w:type="dxa"/>
             <w:tcBorders>
               <w:top w:val="single" w:sz="6" w:space="0" w:color="auto"/>
               <w:left w:val="single" w:sz="6" w:space="0" w:color="auto"/>
@@ -1425,7 +1448,7 @@
         </w:tc>
         <w:tc>
           <w:tcPr>
-            <w:tcW w:w="1673" w:type="pct"/>
+            <w:tcW w:w="2671" w:type="dxa"/>
             <w:tcBorders>
               <w:top w:val="single" w:sz="6" w:space="0" w:color="auto"/>
               <w:left w:val="single" w:sz="6" w:space="0" w:color="auto"/>
@@ -1463,7 +1486,7 @@
         </w:tc>
         <w:tc>
           <w:tcPr>
-            <w:tcW w:w="442" w:type="pct"/>
+            <w:tcW w:w="2128" w:type="dxa"/>
             <w:tcBorders>
               <w:top w:val="single" w:sz="6" w:space="0" w:color="auto"/>
               <w:left w:val="single" w:sz="6" w:space="0" w:color="auto"/>
@@ -1501,7 +1524,7 @@
         </w:tc>
         <w:tc>
           <w:tcPr>
-            <w:tcW w:w="1657" w:type="pct"/>
+            <w:tcW w:w="1843" w:type="dxa"/>
             <w:tcBorders>
               <w:top w:val="single" w:sz="6" w:space="0" w:color="auto"/>
               <w:left w:val="single" w:sz="6" w:space="0" w:color="auto"/>
@@ -1533,13 +1556,13 @@
                 <w:kern w:val="0"/>
                 <w14:ligatures w14:val="none"/>
               </w:rPr>
-              <w:t>5</w:t>
+              <w:t>9</w:t>
             </w:r>
           </w:p>
         </w:tc>
         <w:tc>
           <w:tcPr>
-            <w:tcW w:w="0" w:type="auto"/>
+            <w:tcW w:w="1839" w:type="dxa"/>
             <w:tcBorders>
               <w:top w:val="single" w:sz="6" w:space="0" w:color="auto"/>
               <w:left w:val="single" w:sz="6" w:space="0" w:color="auto"/>
@@ -1571,7 +1594,15 @@
                 <w:kern w:val="0"/>
                 <w14:ligatures w14:val="none"/>
               </w:rPr>
-              <w:t>75,000,000</w:t>
+              <w:t>135</w:t>
+            </w:r>
+            <w:r>
+              <w:rPr>
+                <w:rFonts w:ascii="Times New Roman" w:eastAsia="Times New Roman" w:hAnsi="Times New Roman" w:cs="Times New Roman"/>
+                <w:kern w:val="0"/>
+                <w14:ligatures w14:val="none"/>
+              </w:rPr>
+              <w:t>,000,000</w:t>
             </w:r>
           </w:p>
         </w:tc>
@@ -1641,13 +1672,8 @@
         </w:rPr>
       </w:pPr>
       <w:r>
-        <w:rPr>
-          <w:noProof/>
-        </w:rPr>
-      </w:r>
-      <w:r>
         <w:pict w14:anchorId="3023FCE5">
-          <v:rect id="Horizontal Line 5" o:spid="_x0000_s1068" style="width:468pt;height:.1pt;visibility:visible;mso-wrap-style:square;mso-left-percent:-10001;mso-top-percent:-10001;mso-position-horizontal:absolute;mso-position-horizontal-relative:char;mso-position-vertical:absolute;mso-position-vertical-relative:line;mso-left-percent:-10001;mso-top-percent:-10001;v-text-anchor:top" o:gfxdata="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" filled="f">
+          <v:rect id="Horizontal Line 5" o:spid="_x0000_s1068" alt="" style="width:468pt;height:.1pt;visibility:visible;mso-wrap-style:square;mso-width-percent:0;mso-height-percent:0;mso-left-percent:-10001;mso-top-percent:-10001;mso-position-horizontal:absolute;mso-position-horizontal-relative:char;mso-position-vertical:absolute;mso-position-vertical-relative:line;mso-width-percent:0;mso-height-percent:0;mso-left-percent:-10001;mso-top-percent:-10001;v-text-anchor:top" filled="f">
             <o:lock v:ext="edit" rotation="t" aspectratio="t" verticies="t" text="t" shapetype="t"/>
             <w10:anchorlock/>
           </v:rect>
@@ -1818,13 +1844,8 @@
         </w:rPr>
       </w:pPr>
       <w:r>
-        <w:rPr>
-          <w:noProof/>
-        </w:rPr>
-      </w:r>
-      <w:r>
         <w:pict w14:anchorId="0A89C122">
-          <v:rect id="Horizontal Line 6" o:spid="_x0000_s1067" style="width:468pt;height:.1pt;visibility:visible;mso-wrap-style:square;mso-left-percent:-10001;mso-top-percent:-10001;mso-position-horizontal:absolute;mso-position-horizontal-relative:char;mso-position-vertical:absolute;mso-position-vertical-relative:line;mso-left-percent:-10001;mso-top-percent:-10001;v-text-anchor:top" o:gfxdata="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" filled="f">
+          <v:rect id="Horizontal Line 6" o:spid="_x0000_s1067" alt="" style="width:468pt;height:.1pt;visibility:visible;mso-wrap-style:square;mso-width-percent:0;mso-height-percent:0;mso-left-percent:-10001;mso-top-percent:-10001;mso-position-horizontal:absolute;mso-position-horizontal-relative:char;mso-position-vertical:absolute;mso-position-vertical-relative:line;mso-width-percent:0;mso-height-percent:0;mso-left-percent:-10001;mso-top-percent:-10001;v-text-anchor:top" filled="f">
             <o:lock v:ext="edit" rotation="t" aspectratio="t" verticies="t" text="t" shapetype="t"/>
             <w10:anchorlock/>
           </v:rect>
@@ -1951,13 +1972,8 @@
         </w:rPr>
       </w:pPr>
       <w:r>
-        <w:rPr>
-          <w:noProof/>
-        </w:rPr>
-      </w:r>
-      <w:r>
         <w:pict w14:anchorId="4CEB1A41">
-          <v:rect id="Horizontal Line 7" o:spid="_x0000_s1066" style="width:468pt;height:.1pt;visibility:visible;mso-wrap-style:square;mso-left-percent:-10001;mso-top-percent:-10001;mso-position-horizontal:absolute;mso-position-horizontal-relative:char;mso-position-vertical:absolute;mso-position-vertical-relative:line;mso-left-percent:-10001;mso-top-percent:-10001;v-text-anchor:top" o:gfxdata="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" filled="f">
+          <v:rect id="Horizontal Line 7" o:spid="_x0000_s1066" alt="" style="width:468pt;height:.1pt;visibility:visible;mso-wrap-style:square;mso-width-percent:0;mso-height-percent:0;mso-left-percent:-10001;mso-top-percent:-10001;mso-position-horizontal:absolute;mso-position-horizontal-relative:char;mso-position-vertical:absolute;mso-position-vertical-relative:line;mso-width-percent:0;mso-height-percent:0;mso-left-percent:-10001;mso-top-percent:-10001;v-text-anchor:top" filled="f">
             <o:lock v:ext="edit" rotation="t" aspectratio="t" verticies="t" text="t" shapetype="t"/>
             <w10:anchorlock/>
           </v:rect>
@@ -2073,13 +2089,8 @@
         </w:rPr>
       </w:pPr>
       <w:r>
-        <w:rPr>
-          <w:noProof/>
-        </w:rPr>
-      </w:r>
-      <w:r>
         <w:pict w14:anchorId="486C82C3">
-          <v:rect id="Horizontal Line 8" o:spid="_x0000_s1065" style="width:468pt;height:.1pt;visibility:visible;mso-wrap-style:square;mso-left-percent:-10001;mso-top-percent:-10001;mso-position-horizontal:absolute;mso-position-horizontal-relative:char;mso-position-vertical:absolute;mso-position-vertical-relative:line;mso-left-percent:-10001;mso-top-percent:-10001;v-text-anchor:top" o:gfxdata="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" filled="f">
+          <v:rect id="Horizontal Line 8" o:spid="_x0000_s1065" alt="" style="width:468pt;height:.1pt;visibility:visible;mso-wrap-style:square;mso-width-percent:0;mso-height-percent:0;mso-left-percent:-10001;mso-top-percent:-10001;mso-position-horizontal:absolute;mso-position-horizontal-relative:char;mso-position-vertical:absolute;mso-position-vertical-relative:line;mso-width-percent:0;mso-height-percent:0;mso-left-percent:-10001;mso-top-percent:-10001;v-text-anchor:top" filled="f">
             <o:lock v:ext="edit" rotation="t" aspectratio="t" verticies="t" text="t" shapetype="t"/>
             <w10:anchorlock/>
           </v:rect>
@@ -3191,13 +3202,8 @@
         </w:rPr>
       </w:pPr>
       <w:r>
-        <w:rPr>
-          <w:noProof/>
-        </w:rPr>
-      </w:r>
-      <w:r>
         <w:pict w14:anchorId="06068511">
-          <v:rect id="Horizontal Line 13" o:spid="_x0000_s1064" style="width:468pt;height:.1pt;visibility:visible;mso-wrap-style:square;mso-left-percent:-10001;mso-top-percent:-10001;mso-position-horizontal:absolute;mso-position-horizontal-relative:char;mso-position-vertical:absolute;mso-position-vertical-relative:line;mso-left-percent:-10001;mso-top-percent:-10001;v-text-anchor:top" o:gfxdata="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" filled="f">
+          <v:rect id="Horizontal Line 13" o:spid="_x0000_s1064" alt="" style="width:468pt;height:.1pt;visibility:visible;mso-wrap-style:square;mso-width-percent:0;mso-height-percent:0;mso-left-percent:-10001;mso-top-percent:-10001;mso-position-horizontal:absolute;mso-position-horizontal-relative:char;mso-position-vertical:absolute;mso-position-vertical-relative:line;mso-width-percent:0;mso-height-percent:0;mso-left-percent:-10001;mso-top-percent:-10001;v-text-anchor:top" filled="f">
             <o:lock v:ext="edit" rotation="t" aspectratio="t" verticies="t" text="t" shapetype="t"/>
             <w10:anchorlock/>
           </v:rect>
@@ -3340,13 +3346,8 @@
         </w:rPr>
       </w:pPr>
       <w:r>
-        <w:rPr>
-          <w:noProof/>
-        </w:rPr>
-      </w:r>
-      <w:r>
         <w:pict w14:anchorId="5951C9C0">
-          <v:rect id="Horizontal Line 14" o:spid="_x0000_s1063" style="width:468pt;height:.1pt;visibility:visible;mso-wrap-style:square;mso-left-percent:-10001;mso-top-percent:-10001;mso-position-horizontal:absolute;mso-position-horizontal-relative:char;mso-position-vertical:absolute;mso-position-vertical-relative:line;mso-left-percent:-10001;mso-top-percent:-10001;v-text-anchor:top" o:gfxdata="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" filled="f">
+          <v:rect id="Horizontal Line 14" o:spid="_x0000_s1063" alt="" style="width:468pt;height:.1pt;visibility:visible;mso-wrap-style:square;mso-width-percent:0;mso-height-percent:0;mso-left-percent:-10001;mso-top-percent:-10001;mso-position-horizontal:absolute;mso-position-horizontal-relative:char;mso-position-vertical:absolute;mso-position-vertical-relative:line;mso-width-percent:0;mso-height-percent:0;mso-left-percent:-10001;mso-top-percent:-10001;v-text-anchor:top" filled="f">
             <o:lock v:ext="edit" rotation="t" aspectratio="t" verticies="t" text="t" shapetype="t"/>
             <w10:anchorlock/>
           </v:rect>
@@ -3473,13 +3474,8 @@
         </w:rPr>
       </w:pPr>
       <w:r>
-        <w:rPr>
-          <w:noProof/>
-        </w:rPr>
-      </w:r>
-      <w:r>
         <w:pict w14:anchorId="55196F43">
-          <v:rect id="Horizontal Line 15" o:spid="_x0000_s1062" style="width:468pt;height:.1pt;visibility:visible;mso-wrap-style:square;mso-left-percent:-10001;mso-top-percent:-10001;mso-position-horizontal:absolute;mso-position-horizontal-relative:char;mso-position-vertical:absolute;mso-position-vertical-relative:line;mso-left-percent:-10001;mso-top-percent:-10001;v-text-anchor:top" o:gfxdata="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" filled="f">
+          <v:rect id="Horizontal Line 15" o:spid="_x0000_s1062" alt="" style="width:468pt;height:.1pt;visibility:visible;mso-wrap-style:square;mso-width-percent:0;mso-height-percent:0;mso-left-percent:-10001;mso-top-percent:-10001;mso-position-horizontal:absolute;mso-position-horizontal-relative:char;mso-position-vertical:absolute;mso-position-vertical-relative:line;mso-width-percent:0;mso-height-percent:0;mso-left-percent:-10001;mso-top-percent:-10001;v-text-anchor:top" filled="f">
             <o:lock v:ext="edit" rotation="t" aspectratio="t" verticies="t" text="t" shapetype="t"/>
             <w10:anchorlock/>
           </v:rect>
@@ -3582,6 +3578,7 @@
           <w:kern w:val="0"/>
           <w14:ligatures w14:val="none"/>
         </w:rPr>
+        <w:lastRenderedPageBreak/>
         <w:t>WDDAM economics operate through four integrated workforce infrastructure revenue engines.</w:t>
       </w:r>
     </w:p>
@@ -3594,13 +3591,8 @@
         </w:rPr>
       </w:pPr>
       <w:r>
-        <w:rPr>
-          <w:noProof/>
-        </w:rPr>
-      </w:r>
-      <w:r>
         <w:pict w14:anchorId="6E5C6C3C">
-          <v:rect id="Horizontal Line 16" o:spid="_x0000_s1061" style="width:468pt;height:.1pt;visibility:visible;mso-wrap-style:square;mso-left-percent:-10001;mso-top-percent:-10001;mso-position-horizontal:absolute;mso-position-horizontal-relative:char;mso-position-vertical:absolute;mso-position-vertical-relative:line;mso-left-percent:-10001;mso-top-percent:-10001;v-text-anchor:top" o:gfxdata="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" filled="f">
+          <v:rect id="Horizontal Line 16" o:spid="_x0000_s1061" alt="" style="width:468pt;height:.1pt;visibility:visible;mso-wrap-style:square;mso-width-percent:0;mso-height-percent:0;mso-left-percent:-10001;mso-top-percent:-10001;mso-position-horizontal:absolute;mso-position-horizontal-relative:char;mso-position-vertical:absolute;mso-position-vertical-relative:line;mso-width-percent:0;mso-height-percent:0;mso-left-percent:-10001;mso-top-percent:-10001;v-text-anchor:top" filled="f">
             <o:lock v:ext="edit" rotation="t" aspectratio="t" verticies="t" text="t" shapetype="t"/>
             <w10:anchorlock/>
           </v:rect>
@@ -3688,13 +3680,8 @@
         </w:rPr>
       </w:pPr>
       <w:r>
-        <w:rPr>
-          <w:noProof/>
-        </w:rPr>
-      </w:r>
-      <w:r>
         <w:pict w14:anchorId="58E025FB">
-          <v:rect id="Horizontal Line 17" o:spid="_x0000_s1060" style="width:468pt;height:.1pt;visibility:visible;mso-wrap-style:square;mso-left-percent:-10001;mso-top-percent:-10001;mso-position-horizontal:absolute;mso-position-horizontal-relative:char;mso-position-vertical:absolute;mso-position-vertical-relative:line;mso-left-percent:-10001;mso-top-percent:-10001;v-text-anchor:top" o:gfxdata="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" filled="f">
+          <v:rect id="Horizontal Line 17" o:spid="_x0000_s1060" alt="" style="width:468pt;height:.1pt;visibility:visible;mso-wrap-style:square;mso-width-percent:0;mso-height-percent:0;mso-left-percent:-10001;mso-top-percent:-10001;mso-position-horizontal:absolute;mso-position-horizontal-relative:char;mso-position-vertical:absolute;mso-position-vertical-relative:line;mso-width-percent:0;mso-height-percent:0;mso-left-percent:-10001;mso-top-percent:-10001;v-text-anchor:top" filled="f">
             <o:lock v:ext="edit" rotation="t" aspectratio="t" verticies="t" text="t" shapetype="t"/>
             <w10:anchorlock/>
           </v:rect>
@@ -3825,13 +3812,8 @@
         </w:rPr>
       </w:pPr>
       <w:r>
-        <w:rPr>
-          <w:noProof/>
-        </w:rPr>
-      </w:r>
-      <w:r>
         <w:pict w14:anchorId="4F702C44">
-          <v:rect id="Horizontal Line 18" o:spid="_x0000_s1059" style="width:468pt;height:.1pt;visibility:visible;mso-wrap-style:square;mso-left-percent:-10001;mso-top-percent:-10001;mso-position-horizontal:absolute;mso-position-horizontal-relative:char;mso-position-vertical:absolute;mso-position-vertical-relative:line;mso-left-percent:-10001;mso-top-percent:-10001;v-text-anchor:top" o:gfxdata="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" filled="f">
+          <v:rect id="Horizontal Line 18" o:spid="_x0000_s1059" alt="" style="width:468pt;height:.1pt;visibility:visible;mso-wrap-style:square;mso-width-percent:0;mso-height-percent:0;mso-left-percent:-10001;mso-top-percent:-10001;mso-position-horizontal:absolute;mso-position-horizontal-relative:char;mso-position-vertical:absolute;mso-position-vertical-relative:line;mso-width-percent:0;mso-height-percent:0;mso-left-percent:-10001;mso-top-percent:-10001;v-text-anchor:top" filled="f">
             <o:lock v:ext="edit" rotation="t" aspectratio="t" verticies="t" text="t" shapetype="t"/>
             <w10:anchorlock/>
           </v:rect>
@@ -3919,13 +3901,8 @@
         </w:rPr>
       </w:pPr>
       <w:r>
-        <w:rPr>
-          <w:noProof/>
-        </w:rPr>
-      </w:r>
-      <w:r>
         <w:pict w14:anchorId="0E4FA1FD">
-          <v:rect id="Horizontal Line 19" o:spid="_x0000_s1058" style="width:468pt;height:.1pt;visibility:visible;mso-wrap-style:square;mso-left-percent:-10001;mso-top-percent:-10001;mso-position-horizontal:absolute;mso-position-horizontal-relative:char;mso-position-vertical:absolute;mso-position-vertical-relative:line;mso-left-percent:-10001;mso-top-percent:-10001;v-text-anchor:top" o:gfxdata="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" filled="f">
+          <v:rect id="Horizontal Line 19" o:spid="_x0000_s1058" alt="" style="width:468pt;height:.1pt;visibility:visible;mso-wrap-style:square;mso-width-percent:0;mso-height-percent:0;mso-left-percent:-10001;mso-top-percent:-10001;mso-position-horizontal:absolute;mso-position-horizontal-relative:char;mso-position-vertical:absolute;mso-position-vertical-relative:line;mso-width-percent:0;mso-height-percent:0;mso-left-percent:-10001;mso-top-percent:-10001;v-text-anchor:top" filled="f">
             <o:lock v:ext="edit" rotation="t" aspectratio="t" verticies="t" text="t" shapetype="t"/>
             <w10:anchorlock/>
           </v:rect>
@@ -3986,13 +3963,8 @@
         </w:rPr>
       </w:pPr>
       <w:r>
-        <w:rPr>
-          <w:noProof/>
-        </w:rPr>
-      </w:r>
-      <w:r>
         <w:pict w14:anchorId="00D8570D">
-          <v:rect id="Horizontal Line 20" o:spid="_x0000_s1057" style="width:468pt;height:.1pt;visibility:visible;mso-wrap-style:square;mso-left-percent:-10001;mso-top-percent:-10001;mso-position-horizontal:absolute;mso-position-horizontal-relative:char;mso-position-vertical:absolute;mso-position-vertical-relative:line;mso-left-percent:-10001;mso-top-percent:-10001;v-text-anchor:top" o:gfxdata="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" filled="f">
+          <v:rect id="Horizontal Line 20" o:spid="_x0000_s1057" alt="" style="width:468pt;height:.1pt;visibility:visible;mso-wrap-style:square;mso-width-percent:0;mso-height-percent:0;mso-left-percent:-10001;mso-top-percent:-10001;mso-position-horizontal:absolute;mso-position-horizontal-relative:char;mso-position-vertical:absolute;mso-position-vertical-relative:line;mso-width-percent:0;mso-height-percent:0;mso-left-percent:-10001;mso-top-percent:-10001;v-text-anchor:top" filled="f">
             <o:lock v:ext="edit" rotation="t" aspectratio="t" verticies="t" text="t" shapetype="t"/>
             <w10:anchorlock/>
           </v:rect>
@@ -4068,6 +4040,7 @@
           <w:kern w:val="0"/>
           <w14:ligatures w14:val="none"/>
         </w:rPr>
+        <w:lastRenderedPageBreak/>
         <w:t>Operational workforce continuity economics.</w:t>
       </w:r>
     </w:p>
@@ -4080,13 +4053,8 @@
         </w:rPr>
       </w:pPr>
       <w:r>
-        <w:rPr>
-          <w:noProof/>
-        </w:rPr>
-      </w:r>
-      <w:r>
         <w:pict w14:anchorId="4DD4F92D">
-          <v:rect id="Horizontal Line 21" o:spid="_x0000_s1056" style="width:468pt;height:.1pt;visibility:visible;mso-wrap-style:square;mso-left-percent:-10001;mso-top-percent:-10001;mso-position-horizontal:absolute;mso-position-horizontal-relative:char;mso-position-vertical:absolute;mso-position-vertical-relative:line;mso-left-percent:-10001;mso-top-percent:-10001;v-text-anchor:top" o:gfxdata="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" filled="f">
+          <v:rect id="Horizontal Line 21" o:spid="_x0000_s1056" alt="" style="width:468pt;height:.1pt;visibility:visible;mso-wrap-style:square;mso-width-percent:0;mso-height-percent:0;mso-left-percent:-10001;mso-top-percent:-10001;mso-position-horizontal:absolute;mso-position-horizontal-relative:char;mso-position-vertical:absolute;mso-position-vertical-relative:line;mso-width-percent:0;mso-height-percent:0;mso-left-percent:-10001;mso-top-percent:-10001;v-text-anchor:top" filled="f">
             <o:lock v:ext="edit" rotation="t" aspectratio="t" verticies="t" text="t" shapetype="t"/>
             <w10:anchorlock/>
           </v:rect>
@@ -4117,7 +4085,6 @@
           <w:szCs w:val="36"/>
           <w14:ligatures w14:val="none"/>
         </w:rPr>
-        <w:lastRenderedPageBreak/>
         <w:t>Logic</w:t>
       </w:r>
     </w:p>
@@ -4236,13 +4203,8 @@
         </w:rPr>
       </w:pPr>
       <w:r>
-        <w:rPr>
-          <w:noProof/>
-        </w:rPr>
-      </w:r>
-      <w:r>
         <w:pict w14:anchorId="1F5CB615">
-          <v:rect id="Horizontal Line 22" o:spid="_x0000_s1055" style="width:468pt;height:.1pt;visibility:visible;mso-wrap-style:square;mso-left-percent:-10001;mso-top-percent:-10001;mso-position-horizontal:absolute;mso-position-horizontal-relative:char;mso-position-vertical:absolute;mso-position-vertical-relative:line;mso-left-percent:-10001;mso-top-percent:-10001;v-text-anchor:top" o:gfxdata="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" filled="f">
+          <v:rect id="Horizontal Line 22" o:spid="_x0000_s1055" alt="" style="width:468pt;height:.1pt;visibility:visible;mso-wrap-style:square;mso-width-percent:0;mso-height-percent:0;mso-left-percent:-10001;mso-top-percent:-10001;mso-position-horizontal:absolute;mso-position-horizontal-relative:char;mso-position-vertical:absolute;mso-position-vertical-relative:line;mso-width-percent:0;mso-height-percent:0;mso-left-percent:-10001;mso-top-percent:-10001;v-text-anchor:top" filled="f">
             <o:lock v:ext="edit" rotation="t" aspectratio="t" verticies="t" text="t" shapetype="t"/>
             <w10:anchorlock/>
           </v:rect>
@@ -4303,13 +4265,8 @@
         </w:rPr>
       </w:pPr>
       <w:r>
-        <w:rPr>
-          <w:noProof/>
-        </w:rPr>
-      </w:r>
-      <w:r>
         <w:pict w14:anchorId="0725BAC9">
-          <v:rect id="Horizontal Line 23" o:spid="_x0000_s1054" style="width:468pt;height:.1pt;visibility:visible;mso-wrap-style:square;mso-left-percent:-10001;mso-top-percent:-10001;mso-position-horizontal:absolute;mso-position-horizontal-relative:char;mso-position-vertical:absolute;mso-position-vertical-relative:line;mso-left-percent:-10001;mso-top-percent:-10001;v-text-anchor:top" o:gfxdata="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" filled="f">
+          <v:rect id="Horizontal Line 23" o:spid="_x0000_s1054" alt="" style="width:468pt;height:.1pt;visibility:visible;mso-wrap-style:square;mso-width-percent:0;mso-height-percent:0;mso-left-percent:-10001;mso-top-percent:-10001;mso-position-horizontal:absolute;mso-position-horizontal-relative:char;mso-position-vertical:absolute;mso-position-vertical-relative:line;mso-width-percent:0;mso-height-percent:0;mso-left-percent:-10001;mso-top-percent:-10001;v-text-anchor:top" filled="f">
             <o:lock v:ext="edit" rotation="t" aspectratio="t" verticies="t" text="t" shapetype="t"/>
             <w10:anchorlock/>
           </v:rect>
@@ -4370,13 +4327,8 @@
         </w:rPr>
       </w:pPr>
       <w:r>
-        <w:rPr>
-          <w:noProof/>
-        </w:rPr>
-      </w:r>
-      <w:r>
         <w:pict w14:anchorId="2007C956">
-          <v:rect id="Horizontal Line 24" o:spid="_x0000_s1053" style="width:468pt;height:.1pt;visibility:visible;mso-wrap-style:square;mso-left-percent:-10001;mso-top-percent:-10001;mso-position-horizontal:absolute;mso-position-horizontal-relative:char;mso-position-vertical:absolute;mso-position-vertical-relative:line;mso-left-percent:-10001;mso-top-percent:-10001;v-text-anchor:top" o:gfxdata="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" filled="f">
+          <v:rect id="Horizontal Line 24" o:spid="_x0000_s1053" alt="" style="width:468pt;height:.1pt;visibility:visible;mso-wrap-style:square;mso-width-percent:0;mso-height-percent:0;mso-left-percent:-10001;mso-top-percent:-10001;mso-position-horizontal:absolute;mso-position-horizontal-relative:char;mso-position-vertical:absolute;mso-position-vertical-relative:line;mso-width-percent:0;mso-height-percent:0;mso-left-percent:-10001;mso-top-percent:-10001;v-text-anchor:top" filled="f">
             <o:lock v:ext="edit" rotation="t" aspectratio="t" verticies="t" text="t" shapetype="t"/>
             <w10:anchorlock/>
           </v:rect>
@@ -4464,13 +4416,8 @@
         </w:rPr>
       </w:pPr>
       <w:r>
-        <w:rPr>
-          <w:noProof/>
-        </w:rPr>
-      </w:r>
-      <w:r>
         <w:pict w14:anchorId="1A04BADE">
-          <v:rect id="Horizontal Line 25" o:spid="_x0000_s1052" style="width:468pt;height:.1pt;visibility:visible;mso-wrap-style:square;mso-left-percent:-10001;mso-top-percent:-10001;mso-position-horizontal:absolute;mso-position-horizontal-relative:char;mso-position-vertical:absolute;mso-position-vertical-relative:line;mso-left-percent:-10001;mso-top-percent:-10001;v-text-anchor:top" o:gfxdata="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" filled="f">
+          <v:rect id="Horizontal Line 25" o:spid="_x0000_s1052" alt="" style="width:468pt;height:.1pt;visibility:visible;mso-wrap-style:square;mso-width-percent:0;mso-height-percent:0;mso-left-percent:-10001;mso-top-percent:-10001;mso-position-horizontal:absolute;mso-position-horizontal-relative:char;mso-position-vertical:absolute;mso-position-vertical-relative:line;mso-width-percent:0;mso-height-percent:0;mso-left-percent:-10001;mso-top-percent:-10001;v-text-anchor:top" filled="f">
             <o:lock v:ext="edit" rotation="t" aspectratio="t" verticies="t" text="t" shapetype="t"/>
             <w10:anchorlock/>
           </v:rect>
@@ -4589,6 +4536,7 @@
           <w:kern w:val="0"/>
           <w14:ligatures w14:val="none"/>
         </w:rPr>
+        <w:lastRenderedPageBreak/>
         <w:t>workforce continuity contracts.</w:t>
       </w:r>
     </w:p>
@@ -4601,13 +4549,8 @@
         </w:rPr>
       </w:pPr>
       <w:r>
-        <w:rPr>
-          <w:noProof/>
-        </w:rPr>
-      </w:r>
-      <w:r>
         <w:pict w14:anchorId="024F28A4">
-          <v:rect id="Horizontal Line 26" o:spid="_x0000_s1051" style="width:468pt;height:.1pt;visibility:visible;mso-wrap-style:square;mso-left-percent:-10001;mso-top-percent:-10001;mso-position-horizontal:absolute;mso-position-horizontal-relative:char;mso-position-vertical:absolute;mso-position-vertical-relative:line;mso-left-percent:-10001;mso-top-percent:-10001;v-text-anchor:top" o:gfxdata="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" filled="f">
+          <v:rect id="Horizontal Line 26" o:spid="_x0000_s1051" alt="" style="width:468pt;height:.1pt;visibility:visible;mso-wrap-style:square;mso-width-percent:0;mso-height-percent:0;mso-left-percent:-10001;mso-top-percent:-10001;mso-position-horizontal:absolute;mso-position-horizontal-relative:char;mso-position-vertical:absolute;mso-position-vertical-relative:line;mso-width-percent:0;mso-height-percent:0;mso-left-percent:-10001;mso-top-percent:-10001;v-text-anchor:top" filled="f">
             <o:lock v:ext="edit" rotation="t" aspectratio="t" verticies="t" text="t" shapetype="t"/>
             <w10:anchorlock/>
           </v:rect>
@@ -4638,7 +4581,6 @@
           <w:szCs w:val="36"/>
           <w14:ligatures w14:val="none"/>
         </w:rPr>
-        <w:lastRenderedPageBreak/>
         <w:t>Strategic Characteristic</w:t>
       </w:r>
     </w:p>
@@ -4669,13 +4611,8 @@
         </w:rPr>
       </w:pPr>
       <w:r>
-        <w:rPr>
-          <w:noProof/>
-        </w:rPr>
-      </w:r>
-      <w:r>
         <w:pict w14:anchorId="0B979A6D">
-          <v:rect id="Horizontal Line 27" o:spid="_x0000_s1050" style="width:468pt;height:.1pt;visibility:visible;mso-wrap-style:square;mso-left-percent:-10001;mso-top-percent:-10001;mso-position-horizontal:absolute;mso-position-horizontal-relative:char;mso-position-vertical:absolute;mso-position-vertical-relative:line;mso-left-percent:-10001;mso-top-percent:-10001;v-text-anchor:top" o:gfxdata="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" filled="f">
+          <v:rect id="Horizontal Line 27" o:spid="_x0000_s1050" alt="" style="width:468pt;height:.1pt;visibility:visible;mso-wrap-style:square;mso-width-percent:0;mso-height-percent:0;mso-left-percent:-10001;mso-top-percent:-10001;mso-position-horizontal:absolute;mso-position-horizontal-relative:char;mso-position-vertical:absolute;mso-position-vertical-relative:line;mso-width-percent:0;mso-height-percent:0;mso-left-percent:-10001;mso-top-percent:-10001;v-text-anchor:top" filled="f">
             <o:lock v:ext="edit" rotation="t" aspectratio="t" verticies="t" text="t" shapetype="t"/>
             <w10:anchorlock/>
           </v:rect>
@@ -4763,13 +4700,8 @@
         </w:rPr>
       </w:pPr>
       <w:r>
-        <w:rPr>
-          <w:noProof/>
-        </w:rPr>
-      </w:r>
-      <w:r>
         <w:pict w14:anchorId="6F07DCAD">
-          <v:rect id="Horizontal Line 28" o:spid="_x0000_s1049" style="width:468pt;height:.1pt;visibility:visible;mso-wrap-style:square;mso-left-percent:-10001;mso-top-percent:-10001;mso-position-horizontal:absolute;mso-position-horizontal-relative:char;mso-position-vertical:absolute;mso-position-vertical-relative:line;mso-left-percent:-10001;mso-top-percent:-10001;v-text-anchor:top" o:gfxdata="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" filled="f">
+          <v:rect id="Horizontal Line 28" o:spid="_x0000_s1049" alt="" style="width:468pt;height:.1pt;visibility:visible;mso-wrap-style:square;mso-width-percent:0;mso-height-percent:0;mso-left-percent:-10001;mso-top-percent:-10001;mso-position-horizontal:absolute;mso-position-horizontal-relative:char;mso-position-vertical:absolute;mso-position-vertical-relative:line;mso-width-percent:0;mso-height-percent:0;mso-left-percent:-10001;mso-top-percent:-10001;v-text-anchor:top" filled="f">
             <o:lock v:ext="edit" rotation="t" aspectratio="t" verticies="t" text="t" shapetype="t"/>
             <w10:anchorlock/>
           </v:rect>
@@ -4900,13 +4832,8 @@
         </w:rPr>
       </w:pPr>
       <w:r>
-        <w:rPr>
-          <w:noProof/>
-        </w:rPr>
-      </w:r>
-      <w:r>
         <w:pict w14:anchorId="6101530F">
-          <v:rect id="Horizontal Line 29" o:spid="_x0000_s1048" style="width:468pt;height:.1pt;visibility:visible;mso-wrap-style:square;mso-left-percent:-10001;mso-top-percent:-10001;mso-position-horizontal:absolute;mso-position-horizontal-relative:char;mso-position-vertical:absolute;mso-position-vertical-relative:line;mso-left-percent:-10001;mso-top-percent:-10001;v-text-anchor:top" o:gfxdata="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" filled="f">
+          <v:rect id="Horizontal Line 29" o:spid="_x0000_s1048" alt="" style="width:468pt;height:.1pt;visibility:visible;mso-wrap-style:square;mso-width-percent:0;mso-height-percent:0;mso-left-percent:-10001;mso-top-percent:-10001;mso-position-horizontal:absolute;mso-position-horizontal-relative:char;mso-position-vertical:absolute;mso-position-vertical-relative:line;mso-width-percent:0;mso-height-percent:0;mso-left-percent:-10001;mso-top-percent:-10001;v-text-anchor:top" filled="f">
             <o:lock v:ext="edit" rotation="t" aspectratio="t" verticies="t" text="t" shapetype="t"/>
             <w10:anchorlock/>
           </v:rect>
@@ -4967,13 +4894,8 @@
         </w:rPr>
       </w:pPr>
       <w:r>
-        <w:rPr>
-          <w:noProof/>
-        </w:rPr>
-      </w:r>
-      <w:r>
         <w:pict w14:anchorId="608EFDD0">
-          <v:rect id="Horizontal Line 30" o:spid="_x0000_s1047" style="width:468pt;height:.1pt;visibility:visible;mso-wrap-style:square;mso-left-percent:-10001;mso-top-percent:-10001;mso-position-horizontal:absolute;mso-position-horizontal-relative:char;mso-position-vertical:absolute;mso-position-vertical-relative:line;mso-left-percent:-10001;mso-top-percent:-10001;v-text-anchor:top" o:gfxdata="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" filled="f">
+          <v:rect id="Horizontal Line 30" o:spid="_x0000_s1047" alt="" style="width:468pt;height:.1pt;visibility:visible;mso-wrap-style:square;mso-width-percent:0;mso-height-percent:0;mso-left-percent:-10001;mso-top-percent:-10001;mso-position-horizontal:absolute;mso-position-horizontal-relative:char;mso-position-vertical:absolute;mso-position-vertical-relative:line;mso-width-percent:0;mso-height-percent:0;mso-left-percent:-10001;mso-top-percent:-10001;v-text-anchor:top" filled="f">
             <o:lock v:ext="edit" rotation="t" aspectratio="t" verticies="t" text="t" shapetype="t"/>
             <w10:anchorlock/>
           </v:rect>
@@ -5076,6 +4998,7 @@
           <w:kern w:val="0"/>
           <w14:ligatures w14:val="none"/>
         </w:rPr>
+        <w:lastRenderedPageBreak/>
         <w:t>Deployment economics derive from workforce continuity rather than one-time workforce transactions.</w:t>
       </w:r>
     </w:p>
@@ -5088,13 +5011,8 @@
         </w:rPr>
       </w:pPr>
       <w:r>
-        <w:rPr>
-          <w:noProof/>
-        </w:rPr>
-      </w:r>
-      <w:r>
         <w:pict w14:anchorId="12B95B92">
-          <v:rect id="Horizontal Line 31" o:spid="_x0000_s1046" style="width:468pt;height:.1pt;visibility:visible;mso-wrap-style:square;mso-left-percent:-10001;mso-top-percent:-10001;mso-position-horizontal:absolute;mso-position-horizontal-relative:char;mso-position-vertical:absolute;mso-position-vertical-relative:line;mso-left-percent:-10001;mso-top-percent:-10001;v-text-anchor:top" o:gfxdata="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" filled="f">
+          <v:rect id="Horizontal Line 31" o:spid="_x0000_s1046" alt="" style="width:468pt;height:.1pt;visibility:visible;mso-wrap-style:square;mso-width-percent:0;mso-height-percent:0;mso-left-percent:-10001;mso-top-percent:-10001;mso-position-horizontal:absolute;mso-position-horizontal-relative:char;mso-position-vertical:absolute;mso-position-vertical-relative:line;mso-width-percent:0;mso-height-percent:0;mso-left-percent:-10001;mso-top-percent:-10001;v-text-anchor:top" filled="f">
             <o:lock v:ext="edit" rotation="t" aspectratio="t" verticies="t" text="t" shapetype="t"/>
             <w10:anchorlock/>
           </v:rect>
@@ -5125,7 +5043,6 @@
           <w:szCs w:val="36"/>
           <w14:ligatures w14:val="none"/>
         </w:rPr>
-        <w:lastRenderedPageBreak/>
         <w:t>Traditional Workforce Model</w:t>
       </w:r>
     </w:p>
@@ -5746,13 +5663,8 @@
         </w:rPr>
       </w:pPr>
       <w:r>
-        <w:rPr>
-          <w:noProof/>
-        </w:rPr>
-      </w:r>
-      <w:r>
         <w:pict w14:anchorId="1192D3EC">
-          <v:rect id="Horizontal Line 51" o:spid="_x0000_s1045" style="width:468pt;height:.1pt;visibility:visible;mso-wrap-style:square;mso-left-percent:-10001;mso-top-percent:-10001;mso-position-horizontal:absolute;mso-position-horizontal-relative:char;mso-position-vertical:absolute;mso-position-vertical-relative:line;mso-left-percent:-10001;mso-top-percent:-10001;v-text-anchor:top" o:gfxdata="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" filled="f">
+          <v:rect id="Horizontal Line 51" o:spid="_x0000_s1045" alt="" style="width:468pt;height:.1pt;visibility:visible;mso-wrap-style:square;mso-width-percent:0;mso-height-percent:0;mso-left-percent:-10001;mso-top-percent:-10001;mso-position-horizontal:absolute;mso-position-horizontal-relative:char;mso-position-vertical:absolute;mso-position-vertical-relative:line;mso-width-percent:0;mso-height-percent:0;mso-left-percent:-10001;mso-top-percent:-10001;v-text-anchor:top" filled="f">
             <o:lock v:ext="edit" rotation="t" aspectratio="t" verticies="t" text="t" shapetype="t"/>
             <w10:anchorlock/>
           </v:rect>
@@ -5801,6 +5713,7 @@
           <w:kern w:val="0"/>
           <w14:ligatures w14:val="none"/>
         </w:rPr>
+        <w:lastRenderedPageBreak/>
         <w:t>Recurring deployment systems generate longer-horizon economic continuity than traditional workforce acquisition structures.</w:t>
       </w:r>
     </w:p>
@@ -5813,13 +5726,8 @@
         </w:rPr>
       </w:pPr>
       <w:r>
-        <w:rPr>
-          <w:noProof/>
-        </w:rPr>
-      </w:r>
-      <w:r>
         <w:pict w14:anchorId="6256EF94">
-          <v:rect id="Horizontal Line 52" o:spid="_x0000_s1044" style="width:468pt;height:.1pt;visibility:visible;mso-wrap-style:square;mso-left-percent:-10001;mso-top-percent:-10001;mso-position-horizontal:absolute;mso-position-horizontal-relative:char;mso-position-vertical:absolute;mso-position-vertical-relative:line;mso-left-percent:-10001;mso-top-percent:-10001;v-text-anchor:top" o:gfxdata="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" filled="f">
+          <v:rect id="Horizontal Line 52" o:spid="_x0000_s1044" alt="" style="width:468pt;height:.1pt;visibility:visible;mso-wrap-style:square;mso-width-percent:0;mso-height-percent:0;mso-left-percent:-10001;mso-top-percent:-10001;mso-position-horizontal:absolute;mso-position-horizontal-relative:char;mso-position-vertical:absolute;mso-position-vertical-relative:line;mso-width-percent:0;mso-height-percent:0;mso-left-percent:-10001;mso-top-percent:-10001;v-text-anchor:top" filled="f">
             <o:lock v:ext="edit" rotation="t" aspectratio="t" verticies="t" text="t" shapetype="t"/>
             <w10:anchorlock/>
           </v:rect>
@@ -5850,7 +5758,6 @@
           <w:szCs w:val="48"/>
           <w14:ligatures w14:val="none"/>
         </w:rPr>
-        <w:lastRenderedPageBreak/>
         <w:t>SECTION 5</w:t>
       </w:r>
     </w:p>
@@ -5935,13 +5842,8 @@
         </w:rPr>
       </w:pPr>
       <w:r>
-        <w:rPr>
-          <w:noProof/>
-        </w:rPr>
-      </w:r>
-      <w:r>
         <w:pict w14:anchorId="1C615C10">
-          <v:rect id="Horizontal Line 53" o:spid="_x0000_s1043" style="width:468pt;height:.1pt;visibility:visible;mso-wrap-style:square;mso-left-percent:-10001;mso-top-percent:-10001;mso-position-horizontal:absolute;mso-position-horizontal-relative:char;mso-position-vertical:absolute;mso-position-vertical-relative:line;mso-left-percent:-10001;mso-top-percent:-10001;v-text-anchor:top" o:gfxdata="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" filled="f">
+          <v:rect id="Horizontal Line 53" o:spid="_x0000_s1043" alt="" style="width:468pt;height:.1pt;visibility:visible;mso-wrap-style:square;mso-width-percent:0;mso-height-percent:0;mso-left-percent:-10001;mso-top-percent:-10001;mso-position-horizontal:absolute;mso-position-horizontal-relative:char;mso-position-vertical:absolute;mso-position-vertical-relative:line;mso-width-percent:0;mso-height-percent:0;mso-left-percent:-10001;mso-top-percent:-10001;v-text-anchor:top" filled="f">
             <o:lock v:ext="edit" rotation="t" aspectratio="t" verticies="t" text="t" shapetype="t"/>
             <w10:anchorlock/>
           </v:rect>
@@ -7029,6 +6931,7 @@
                 <w:kern w:val="0"/>
                 <w14:ligatures w14:val="none"/>
               </w:rPr>
+              <w:lastRenderedPageBreak/>
               <w:t>4</w:t>
             </w:r>
           </w:p>
@@ -7252,7 +7155,6 @@
           <w:szCs w:val="36"/>
           <w14:ligatures w14:val="none"/>
         </w:rPr>
-        <w:lastRenderedPageBreak/>
         <w:t>Scaling Characteristic</w:t>
       </w:r>
     </w:p>
@@ -7371,13 +7273,8 @@
         </w:rPr>
       </w:pPr>
       <w:r>
-        <w:rPr>
-          <w:noProof/>
-        </w:rPr>
-      </w:r>
-      <w:r>
         <w:pict w14:anchorId="2D2F1122">
-          <v:rect id="Horizontal Line 57" o:spid="_x0000_s1042" style="width:468pt;height:.1pt;visibility:visible;mso-wrap-style:square;mso-left-percent:-10001;mso-top-percent:-10001;mso-position-horizontal:absolute;mso-position-horizontal-relative:char;mso-position-vertical:absolute;mso-position-vertical-relative:line;mso-left-percent:-10001;mso-top-percent:-10001;v-text-anchor:top" o:gfxdata="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" filled="f">
+          <v:rect id="Horizontal Line 57" o:spid="_x0000_s1042" alt="" style="width:468pt;height:.1pt;visibility:visible;mso-wrap-style:square;mso-width-percent:0;mso-height-percent:0;mso-left-percent:-10001;mso-top-percent:-10001;mso-position-horizontal:absolute;mso-position-horizontal-relative:char;mso-position-vertical:absolute;mso-position-vertical-relative:line;mso-width-percent:0;mso-height-percent:0;mso-left-percent:-10001;mso-top-percent:-10001;v-text-anchor:top" filled="f">
             <o:lock v:ext="edit" rotation="t" aspectratio="t" verticies="t" text="t" shapetype="t"/>
             <w10:anchorlock/>
           </v:rect>
@@ -7492,13 +7389,8 @@
         </w:rPr>
       </w:pPr>
       <w:r>
-        <w:rPr>
-          <w:noProof/>
-        </w:rPr>
-      </w:r>
-      <w:r>
         <w:pict w14:anchorId="09423C2D">
-          <v:rect id="Horizontal Line 58" o:spid="_x0000_s1041" style="width:468pt;height:.1pt;visibility:visible;mso-wrap-style:square;mso-left-percent:-10001;mso-top-percent:-10001;mso-position-horizontal:absolute;mso-position-horizontal-relative:char;mso-position-vertical:absolute;mso-position-vertical-relative:line;mso-left-percent:-10001;mso-top-percent:-10001;v-text-anchor:top" o:gfxdata="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" filled="f">
+          <v:rect id="Horizontal Line 58" o:spid="_x0000_s1041" alt="" style="width:468pt;height:.1pt;visibility:visible;mso-wrap-style:square;mso-width-percent:0;mso-height-percent:0;mso-left-percent:-10001;mso-top-percent:-10001;mso-position-horizontal:absolute;mso-position-horizontal-relative:char;mso-position-vertical:absolute;mso-position-vertical-relative:line;mso-width-percent:0;mso-height-percent:0;mso-left-percent:-10001;mso-top-percent:-10001;v-text-anchor:top" filled="f">
             <o:lock v:ext="edit" rotation="t" aspectratio="t" verticies="t" text="t" shapetype="t"/>
             <w10:anchorlock/>
           </v:rect>
@@ -7904,6 +7796,7 @@
           <w:szCs w:val="36"/>
           <w14:ligatures w14:val="none"/>
         </w:rPr>
+        <w:lastRenderedPageBreak/>
         <w:t>Capacity Drivers</w:t>
       </w:r>
     </w:p>
@@ -8026,13 +7919,8 @@
         </w:rPr>
       </w:pPr>
       <w:r>
-        <w:rPr>
-          <w:noProof/>
-        </w:rPr>
-      </w:r>
-      <w:r>
         <w:pict w14:anchorId="41272522">
-          <v:rect id="Horizontal Line 61" o:spid="_x0000_s1040" style="width:468pt;height:.1pt;visibility:visible;mso-wrap-style:square;mso-left-percent:-10001;mso-top-percent:-10001;mso-position-horizontal:absolute;mso-position-horizontal-relative:char;mso-position-vertical:absolute;mso-position-vertical-relative:line;mso-left-percent:-10001;mso-top-percent:-10001;v-text-anchor:top" o:gfxdata="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" filled="f">
+          <v:rect id="Horizontal Line 61" o:spid="_x0000_s1040" alt="" style="width:468pt;height:.1pt;visibility:visible;mso-wrap-style:square;mso-width-percent:0;mso-height-percent:0;mso-left-percent:-10001;mso-top-percent:-10001;mso-position-horizontal:absolute;mso-position-horizontal-relative:char;mso-position-vertical:absolute;mso-position-vertical-relative:line;mso-width-percent:0;mso-height-percent:0;mso-left-percent:-10001;mso-top-percent:-10001;v-text-anchor:top" filled="f">
             <o:lock v:ext="edit" rotation="t" aspectratio="t" verticies="t" text="t" shapetype="t"/>
             <w10:anchorlock/>
           </v:rect>
@@ -8181,13 +8069,8 @@
         </w:rPr>
       </w:pPr>
       <w:r>
-        <w:rPr>
-          <w:noProof/>
-        </w:rPr>
-      </w:r>
-      <w:r>
         <w:pict w14:anchorId="17DF69E1">
-          <v:rect id="Horizontal Line 62" o:spid="_x0000_s1039" style="width:468pt;height:.1pt;visibility:visible;mso-wrap-style:square;mso-left-percent:-10001;mso-top-percent:-10001;mso-position-horizontal:absolute;mso-position-horizontal-relative:char;mso-position-vertical:absolute;mso-position-vertical-relative:line;mso-left-percent:-10001;mso-top-percent:-10001;v-text-anchor:top" o:gfxdata="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" filled="f">
+          <v:rect id="Horizontal Line 62" o:spid="_x0000_s1039" alt="" style="width:468pt;height:.1pt;visibility:visible;mso-wrap-style:square;mso-width-percent:0;mso-height-percent:0;mso-left-percent:-10001;mso-top-percent:-10001;mso-position-horizontal:absolute;mso-position-horizontal-relative:char;mso-position-vertical:absolute;mso-position-vertical-relative:line;mso-width-percent:0;mso-height-percent:0;mso-left-percent:-10001;mso-top-percent:-10001;v-text-anchor:top" filled="f">
             <o:lock v:ext="edit" rotation="t" aspectratio="t" verticies="t" text="t" shapetype="t"/>
             <w10:anchorlock/>
           </v:rect>
@@ -8302,13 +8185,8 @@
         </w:rPr>
       </w:pPr>
       <w:r>
-        <w:rPr>
-          <w:noProof/>
-        </w:rPr>
-      </w:r>
-      <w:r>
         <w:pict w14:anchorId="1D5A9480">
-          <v:rect id="Horizontal Line 63" o:spid="_x0000_s1038" style="width:468pt;height:.1pt;visibility:visible;mso-wrap-style:square;mso-left-percent:-10001;mso-top-percent:-10001;mso-position-horizontal:absolute;mso-position-horizontal-relative:char;mso-position-vertical:absolute;mso-position-vertical-relative:line;mso-left-percent:-10001;mso-top-percent:-10001;v-text-anchor:top" o:gfxdata="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" filled="f">
+          <v:rect id="Horizontal Line 63" o:spid="_x0000_s1038" alt="" style="width:468pt;height:.1pt;visibility:visible;mso-wrap-style:square;mso-width-percent:0;mso-height-percent:0;mso-left-percent:-10001;mso-top-percent:-10001;mso-position-horizontal:absolute;mso-position-horizontal-relative:char;mso-position-vertical:absolute;mso-position-vertical-relative:line;mso-width-percent:0;mso-height-percent:0;mso-left-percent:-10001;mso-top-percent:-10001;v-text-anchor:top" filled="f">
             <o:lock v:ext="edit" rotation="t" aspectratio="t" verticies="t" text="t" shapetype="t"/>
             <w10:anchorlock/>
           </v:rect>
@@ -8645,6 +8523,7 @@
                 <w:kern w:val="0"/>
                 <w14:ligatures w14:val="none"/>
               </w:rPr>
+              <w:lastRenderedPageBreak/>
               <w:t>SWD-INV Layer</w:t>
             </w:r>
           </w:p>
@@ -8897,7 +8776,6 @@
           <w:szCs w:val="48"/>
           <w14:ligatures w14:val="none"/>
         </w:rPr>
-        <w:lastRenderedPageBreak/>
         <w:t>8,760,000,000 FCFA</w:t>
       </w:r>
     </w:p>
@@ -8910,13 +8788,8 @@
         </w:rPr>
       </w:pPr>
       <w:r>
-        <w:rPr>
-          <w:noProof/>
-        </w:rPr>
-      </w:r>
-      <w:r>
         <w:pict w14:anchorId="1AE7811C">
-          <v:rect id="Horizontal Line 67" o:spid="_x0000_s1037" style="width:468pt;height:.1pt;visibility:visible;mso-wrap-style:square;mso-left-percent:-10001;mso-top-percent:-10001;mso-position-horizontal:absolute;mso-position-horizontal-relative:char;mso-position-vertical:absolute;mso-position-vertical-relative:line;mso-left-percent:-10001;mso-top-percent:-10001;v-text-anchor:top" o:gfxdata="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" filled="f">
+          <v:rect id="Horizontal Line 67" o:spid="_x0000_s1037" alt="" style="width:468pt;height:.1pt;visibility:visible;mso-wrap-style:square;mso-width-percent:0;mso-height-percent:0;mso-left-percent:-10001;mso-top-percent:-10001;mso-position-horizontal:absolute;mso-position-horizontal-relative:char;mso-position-vertical:absolute;mso-position-vertical-relative:line;mso-width-percent:0;mso-height-percent:0;mso-left-percent:-10001;mso-top-percent:-10001;v-text-anchor:top" filled="f">
             <o:lock v:ext="edit" rotation="t" aspectratio="t" verticies="t" text="t" shapetype="t"/>
             <w10:anchorlock/>
           </v:rect>
@@ -9065,13 +8938,8 @@
         </w:rPr>
       </w:pPr>
       <w:r>
-        <w:rPr>
-          <w:noProof/>
-        </w:rPr>
-      </w:r>
-      <w:r>
         <w:pict w14:anchorId="5E9A0897">
-          <v:rect id="Horizontal Line 68" o:spid="_x0000_s1036" style="width:468pt;height:.1pt;visibility:visible;mso-wrap-style:square;mso-left-percent:-10001;mso-top-percent:-10001;mso-position-horizontal:absolute;mso-position-horizontal-relative:char;mso-position-vertical:absolute;mso-position-vertical-relative:line;mso-left-percent:-10001;mso-top-percent:-10001;v-text-anchor:top" o:gfxdata="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" filled="f">
+          <v:rect id="Horizontal Line 68" o:spid="_x0000_s1036" alt="" style="width:468pt;height:.1pt;visibility:visible;mso-wrap-style:square;mso-width-percent:0;mso-height-percent:0;mso-left-percent:-10001;mso-top-percent:-10001;mso-position-horizontal:absolute;mso-position-horizontal-relative:char;mso-position-vertical:absolute;mso-position-vertical-relative:line;mso-width-percent:0;mso-height-percent:0;mso-left-percent:-10001;mso-top-percent:-10001;v-text-anchor:top" filled="f">
             <o:lock v:ext="edit" rotation="t" aspectratio="t" verticies="t" text="t" shapetype="t"/>
             <w10:anchorlock/>
           </v:rect>
@@ -9220,13 +9088,8 @@
         </w:rPr>
       </w:pPr>
       <w:r>
-        <w:rPr>
-          <w:noProof/>
-        </w:rPr>
-      </w:r>
-      <w:r>
         <w:pict w14:anchorId="35C5F9F9">
-          <v:rect id="Horizontal Line 69" o:spid="_x0000_s1035" style="width:468pt;height:.1pt;visibility:visible;mso-wrap-style:square;mso-left-percent:-10001;mso-top-percent:-10001;mso-position-horizontal:absolute;mso-position-horizontal-relative:char;mso-position-vertical:absolute;mso-position-vertical-relative:line;mso-left-percent:-10001;mso-top-percent:-10001;v-text-anchor:top" o:gfxdata="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" filled="f">
+          <v:rect id="Horizontal Line 69" o:spid="_x0000_s1035" alt="" style="width:468pt;height:.1pt;visibility:visible;mso-wrap-style:square;mso-width-percent:0;mso-height-percent:0;mso-left-percent:-10001;mso-top-percent:-10001;mso-position-horizontal:absolute;mso-position-horizontal-relative:char;mso-position-vertical:absolute;mso-position-vertical-relative:line;mso-width-percent:0;mso-height-percent:0;mso-left-percent:-10001;mso-top-percent:-10001;v-text-anchor:top" filled="f">
             <o:lock v:ext="edit" rotation="t" aspectratio="t" verticies="t" text="t" shapetype="t"/>
             <w10:anchorlock/>
           </v:rect>
@@ -9311,6 +9174,7 @@
           <w:szCs w:val="36"/>
           <w14:ligatures w14:val="none"/>
         </w:rPr>
+        <w:lastRenderedPageBreak/>
         <w:t>Analytical Statement</w:t>
       </w:r>
     </w:p>
@@ -9341,13 +9205,8 @@
         </w:rPr>
       </w:pPr>
       <w:r>
-        <w:rPr>
-          <w:noProof/>
-        </w:rPr>
-      </w:r>
-      <w:r>
         <w:pict w14:anchorId="457D8D06">
-          <v:rect id="Horizontal Line 70" o:spid="_x0000_s1034" style="width:468pt;height:.1pt;visibility:visible;mso-wrap-style:square;mso-left-percent:-10001;mso-top-percent:-10001;mso-position-horizontal:absolute;mso-position-horizontal-relative:char;mso-position-vertical:absolute;mso-position-vertical-relative:line;mso-left-percent:-10001;mso-top-percent:-10001;v-text-anchor:top" o:gfxdata="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" filled="f">
+          <v:rect id="Horizontal Line 70" o:spid="_x0000_s1034" alt="" style="width:468pt;height:.1pt;visibility:visible;mso-wrap-style:square;mso-width-percent:0;mso-height-percent:0;mso-left-percent:-10001;mso-top-percent:-10001;mso-position-horizontal:absolute;mso-position-horizontal-relative:char;mso-position-vertical:absolute;mso-position-vertical-relative:line;mso-width-percent:0;mso-height-percent:0;mso-left-percent:-10001;mso-top-percent:-10001;v-text-anchor:top" filled="f">
             <o:lock v:ext="edit" rotation="t" aspectratio="t" verticies="t" text="t" shapetype="t"/>
             <w10:anchorlock/>
           </v:rect>
@@ -9445,7 +9304,6 @@
                 <w:kern w:val="0"/>
                 <w14:ligatures w14:val="none"/>
               </w:rPr>
-              <w:lastRenderedPageBreak/>
               <w:t>Layer</w:t>
             </w:r>
           </w:p>
@@ -9954,13 +9812,8 @@
         </w:rPr>
       </w:pPr>
       <w:r>
-        <w:rPr>
-          <w:noProof/>
-        </w:rPr>
-      </w:r>
-      <w:r>
         <w:pict w14:anchorId="45AFDDDE">
-          <v:rect id="Horizontal Line 75" o:spid="_x0000_s1033" style="width:468pt;height:.1pt;visibility:visible;mso-wrap-style:square;mso-left-percent:-10001;mso-top-percent:-10001;mso-position-horizontal:absolute;mso-position-horizontal-relative:char;mso-position-vertical:absolute;mso-position-vertical-relative:line;mso-left-percent:-10001;mso-top-percent:-10001;v-text-anchor:top" o:gfxdata="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" filled="f">
+          <v:rect id="Horizontal Line 75" o:spid="_x0000_s1033" alt="" style="width:468pt;height:.1pt;visibility:visible;mso-wrap-style:square;mso-width-percent:0;mso-height-percent:0;mso-left-percent:-10001;mso-top-percent:-10001;mso-position-horizontal:absolute;mso-position-horizontal-relative:char;mso-position-vertical:absolute;mso-position-vertical-relative:line;mso-width-percent:0;mso-height-percent:0;mso-left-percent:-10001;mso-top-percent:-10001;v-text-anchor:top" filled="f">
             <o:lock v:ext="edit" rotation="t" aspectratio="t" verticies="t" text="t" shapetype="t"/>
             <w10:anchorlock/>
           </v:rect>
@@ -10170,6 +10023,7 @@
           <w:szCs w:val="48"/>
           <w14:ligatures w14:val="none"/>
         </w:rPr>
+        <w:lastRenderedPageBreak/>
         <w:t>Scenario Analysis</w:t>
       </w:r>
     </w:p>
@@ -10261,7 +10115,6 @@
           <w:szCs w:val="48"/>
           <w14:ligatures w14:val="none"/>
         </w:rPr>
-        <w:lastRenderedPageBreak/>
         <w:t>SCENARIO 01 — CONSERVATIVE</w:t>
       </w:r>
     </w:p>
@@ -10718,6 +10571,7 @@
           <w:kern w:val="0"/>
           <w14:ligatures w14:val="none"/>
         </w:rPr>
+        <w:lastRenderedPageBreak/>
         <w:t>governance stability.</w:t>
       </w:r>
     </w:p>
@@ -10813,7 +10667,6 @@
           <w:kern w:val="0"/>
           <w14:ligatures w14:val="none"/>
         </w:rPr>
-        <w:lastRenderedPageBreak/>
         <w:t>accelerated institutional adoption,</w:t>
       </w:r>
     </w:p>
@@ -11164,13 +11017,8 @@
         </w:rPr>
       </w:pPr>
       <w:r>
-        <w:rPr>
-          <w:noProof/>
-        </w:rPr>
-      </w:r>
-      <w:r>
         <w:pict w14:anchorId="46D97212">
-          <v:rect id="Horizontal Line 85" o:spid="_x0000_s1032" style="width:468pt;height:.1pt;visibility:visible;mso-wrap-style:square;mso-left-percent:-10001;mso-top-percent:-10001;mso-position-horizontal:absolute;mso-position-horizontal-relative:char;mso-position-vertical:absolute;mso-position-vertical-relative:line;mso-left-percent:-10001;mso-top-percent:-10001;v-text-anchor:top" o:gfxdata="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" filled="f">
+          <v:rect id="Horizontal Line 85" o:spid="_x0000_s1032" alt="" style="width:468pt;height:.1pt;visibility:visible;mso-wrap-style:square;mso-width-percent:0;mso-height-percent:0;mso-left-percent:-10001;mso-top-percent:-10001;mso-position-horizontal:absolute;mso-position-horizontal-relative:char;mso-position-vertical:absolute;mso-position-vertical-relative:line;mso-width-percent:0;mso-height-percent:0;mso-left-percent:-10001;mso-top-percent:-10001;v-text-anchor:top" filled="f">
             <o:lock v:ext="edit" rotation="t" aspectratio="t" verticies="t" text="t" shapetype="t"/>
             <w10:anchorlock/>
           </v:rect>
@@ -11201,6 +11049,7 @@
           <w:szCs w:val="48"/>
           <w14:ligatures w14:val="none"/>
         </w:rPr>
+        <w:lastRenderedPageBreak/>
         <w:t>EMPLOYMENT IMPACT</w:t>
       </w:r>
     </w:p>
@@ -11328,13 +11177,8 @@
         </w:rPr>
       </w:pPr>
       <w:r>
-        <w:rPr>
-          <w:noProof/>
-        </w:rPr>
-      </w:r>
-      <w:r>
         <w:pict w14:anchorId="6593E073">
-          <v:rect id="Horizontal Line 86" o:spid="_x0000_s1031" style="width:468pt;height:.1pt;visibility:visible;mso-wrap-style:square;mso-left-percent:-10001;mso-top-percent:-10001;mso-position-horizontal:absolute;mso-position-horizontal-relative:char;mso-position-vertical:absolute;mso-position-vertical-relative:line;mso-left-percent:-10001;mso-top-percent:-10001;v-text-anchor:top" o:gfxdata="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" filled="f">
+          <v:rect id="Horizontal Line 86" o:spid="_x0000_s1031" alt="" style="width:468pt;height:.1pt;visibility:visible;mso-wrap-style:square;mso-width-percent:0;mso-height-percent:0;mso-left-percent:-10001;mso-top-percent:-10001;mso-position-horizontal:absolute;mso-position-horizontal-relative:char;mso-position-vertical:absolute;mso-position-vertical-relative:line;mso-width-percent:0;mso-height-percent:0;mso-left-percent:-10001;mso-top-percent:-10001;v-text-anchor:top" filled="f">
             <o:lock v:ext="edit" rotation="t" aspectratio="t" verticies="t" text="t" shapetype="t"/>
             <w10:anchorlock/>
           </v:rect>
@@ -11492,13 +11336,8 @@
         </w:rPr>
       </w:pPr>
       <w:r>
-        <w:rPr>
-          <w:noProof/>
-        </w:rPr>
-      </w:r>
-      <w:r>
         <w:pict w14:anchorId="387CA53F">
-          <v:rect id="Horizontal Line 87" o:spid="_x0000_s1030" style="width:468pt;height:.1pt;visibility:visible;mso-wrap-style:square;mso-left-percent:-10001;mso-top-percent:-10001;mso-position-horizontal:absolute;mso-position-horizontal-relative:char;mso-position-vertical:absolute;mso-position-vertical-relative:line;mso-left-percent:-10001;mso-top-percent:-10001;v-text-anchor:top" o:gfxdata="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" filled="f">
+          <v:rect id="Horizontal Line 87" o:spid="_x0000_s1030" alt="" style="width:468pt;height:.1pt;visibility:visible;mso-wrap-style:square;mso-width-percent:0;mso-height-percent:0;mso-left-percent:-10001;mso-top-percent:-10001;mso-position-horizontal:absolute;mso-position-horizontal-relative:char;mso-position-vertical:absolute;mso-position-vertical-relative:line;mso-width-percent:0;mso-height-percent:0;mso-left-percent:-10001;mso-top-percent:-10001;v-text-anchor:top" filled="f">
             <o:lock v:ext="edit" rotation="t" aspectratio="t" verticies="t" text="t" shapetype="t"/>
             <w10:anchorlock/>
           </v:rect>
@@ -11634,13 +11473,8 @@
         </w:rPr>
       </w:pPr>
       <w:r>
-        <w:rPr>
-          <w:noProof/>
-        </w:rPr>
-      </w:r>
-      <w:r>
         <w:pict w14:anchorId="10EF46C2">
-          <v:rect id="Horizontal Line 88" o:spid="_x0000_s1029" style="width:468pt;height:.1pt;visibility:visible;mso-wrap-style:square;mso-left-percent:-10001;mso-top-percent:-10001;mso-position-horizontal:absolute;mso-position-horizontal-relative:char;mso-position-vertical:absolute;mso-position-vertical-relative:line;mso-left-percent:-10001;mso-top-percent:-10001;v-text-anchor:top" o:gfxdata="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" filled="f">
+          <v:rect id="Horizontal Line 88" o:spid="_x0000_s1029" alt="" style="width:468pt;height:.1pt;visibility:visible;mso-wrap-style:square;mso-width-percent:0;mso-height-percent:0;mso-left-percent:-10001;mso-top-percent:-10001;mso-position-horizontal:absolute;mso-position-horizontal-relative:char;mso-position-vertical:absolute;mso-position-vertical-relative:line;mso-width-percent:0;mso-height-percent:0;mso-left-percent:-10001;mso-top-percent:-10001;v-text-anchor:top" filled="f">
             <o:lock v:ext="edit" rotation="t" aspectratio="t" verticies="t" text="t" shapetype="t"/>
             <w10:anchorlock/>
           </v:rect>
@@ -11786,6 +11620,7 @@
           <w:kern w:val="0"/>
           <w14:ligatures w14:val="none"/>
         </w:rPr>
+        <w:lastRenderedPageBreak/>
         <w:t>deployment stability.</w:t>
       </w:r>
     </w:p>
@@ -11798,13 +11633,8 @@
         </w:rPr>
       </w:pPr>
       <w:r>
-        <w:rPr>
-          <w:noProof/>
-        </w:rPr>
-      </w:r>
-      <w:r>
         <w:pict w14:anchorId="0DB75BFA">
-          <v:rect id="Horizontal Line 89" o:spid="_x0000_s1028" style="width:468pt;height:.1pt;visibility:visible;mso-wrap-style:square;mso-left-percent:-10001;mso-top-percent:-10001;mso-position-horizontal:absolute;mso-position-horizontal-relative:char;mso-position-vertical:absolute;mso-position-vertical-relative:line;mso-left-percent:-10001;mso-top-percent:-10001;v-text-anchor:top" o:gfxdata="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" filled="f">
+          <v:rect id="Horizontal Line 89" o:spid="_x0000_s1028" alt="" style="width:468pt;height:.1pt;visibility:visible;mso-wrap-style:square;mso-width-percent:0;mso-height-percent:0;mso-left-percent:-10001;mso-top-percent:-10001;mso-position-horizontal:absolute;mso-position-horizontal-relative:char;mso-position-vertical:absolute;mso-position-vertical-relative:line;mso-width-percent:0;mso-height-percent:0;mso-left-percent:-10001;mso-top-percent:-10001;v-text-anchor:top" filled="f">
             <o:lock v:ext="edit" rotation="t" aspectratio="t" verticies="t" text="t" shapetype="t"/>
             <w10:anchorlock/>
           </v:rect>
@@ -11906,7 +11736,6 @@
           <w:kern w:val="0"/>
           <w14:ligatures w14:val="none"/>
         </w:rPr>
-        <w:lastRenderedPageBreak/>
         <w:t>African industrial competitiveness,</w:t>
       </w:r>
     </w:p>
@@ -11963,13 +11792,8 @@
         </w:rPr>
       </w:pPr>
       <w:r>
-        <w:rPr>
-          <w:noProof/>
-        </w:rPr>
-      </w:r>
-      <w:r>
         <w:pict w14:anchorId="50FC070C">
-          <v:rect id="Horizontal Line 90" o:spid="_x0000_s1027" style="width:468pt;height:.1pt;visibility:visible;mso-wrap-style:square;mso-left-percent:-10001;mso-top-percent:-10001;mso-position-horizontal:absolute;mso-position-horizontal-relative:char;mso-position-vertical:absolute;mso-position-vertical-relative:line;mso-left-percent:-10001;mso-top-percent:-10001;v-text-anchor:top" o:gfxdata="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" filled="f">
+          <v:rect id="Horizontal Line 90" o:spid="_x0000_s1027" alt="" style="width:468pt;height:.1pt;visibility:visible;mso-wrap-style:square;mso-width-percent:0;mso-height-percent:0;mso-left-percent:-10001;mso-top-percent:-10001;mso-position-horizontal:absolute;mso-position-horizontal-relative:char;mso-position-vertical:absolute;mso-position-vertical-relative:line;mso-width-percent:0;mso-height-percent:0;mso-left-percent:-10001;mso-top-percent:-10001;v-text-anchor:top" filled="f">
             <o:lock v:ext="edit" rotation="t" aspectratio="t" verticies="t" text="t" shapetype="t"/>
             <w10:anchorlock/>
           </v:rect>
@@ -12167,13 +11991,8 @@
         </w:rPr>
       </w:pPr>
       <w:r>
-        <w:rPr>
-          <w:noProof/>
-        </w:rPr>
-      </w:r>
-      <w:r>
         <w:pict w14:anchorId="7C79CB15">
-          <v:rect id="Horizontal Line 91" o:spid="_x0000_s1026" style="width:468pt;height:.1pt;visibility:visible;mso-wrap-style:square;mso-left-percent:-10001;mso-top-percent:-10001;mso-position-horizontal:absolute;mso-position-horizontal-relative:char;mso-position-vertical:absolute;mso-position-vertical-relative:line;mso-left-percent:-10001;mso-top-percent:-10001;v-text-anchor:top" o:gfxdata="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" filled="f">
+          <v:rect id="Horizontal Line 91" o:spid="_x0000_s1026" alt="" style="width:468pt;height:.1pt;visibility:visible;mso-wrap-style:square;mso-width-percent:0;mso-height-percent:0;mso-left-percent:-10001;mso-top-percent:-10001;mso-position-horizontal:absolute;mso-position-horizontal-relative:char;mso-position-vertical:absolute;mso-position-vertical-relative:line;mso-width-percent:0;mso-height-percent:0;mso-left-percent:-10001;mso-top-percent:-10001;v-text-anchor:top" filled="f">
             <o:lock v:ext="edit" rotation="t" aspectratio="t" verticies="t" text="t" shapetype="t"/>
             <w10:anchorlock/>
           </v:rect>

</xml_diff>